<commit_message>
Add course legislation and topics to certificates
</commit_message>
<xml_diff>
--- a/mcorsi/assets/default_certificate.docx
+++ b/mcorsi/assets/default_certificate.docx
@@ -96,6 +96,36 @@
           <w:sz w:val="40"/>
         </w:rPr>
         <w:t>{{ course_title }}</w:t>
+      </w:r>
+    </w:p>
+    <w:p>
+      <w:pPr>
+        <w:keepLines/>
+        <w:spacing w:before="0" w:after="40"/>
+        <w:jc w:val="center"/>
+      </w:pPr>
+      <w:r>
+        <w:rPr>
+          <w:rFonts w:ascii="Aptos" w:hAnsi="Aptos"/>
+          <w:color w:val="616E6B"/>
+          <w:sz w:val="17"/>
+        </w:rPr>
+        <w:t>{% if course_topics %}Argomenti trattati: {{ course_topics }}{% endif %}</w:t>
+      </w:r>
+    </w:p>
+    <w:p>
+      <w:pPr>
+        <w:keepLines/>
+        <w:spacing w:before="0" w:after="40"/>
+        <w:jc w:val="center"/>
+      </w:pPr>
+      <w:r>
+        <w:rPr>
+          <w:rFonts w:ascii="Aptos" w:hAnsi="Aptos"/>
+          <w:color w:val="616E6B"/>
+          <w:sz w:val="17"/>
+        </w:rPr>
+        <w:t>{% if course_legal_references %}Riferimenti legislativi: {{ course_legal_references }}{% endif %}</w:t>
       </w:r>
     </w:p>
     <w:p>

</xml_diff>